<commit_message>
Actualiza niveles Tec Plantilla 2
</commit_message>
<xml_diff>
--- a/plantillas/Plantilla_2_GuionDidactico.docx
+++ b/plantillas/Plantilla_2_GuionDidactico.docx
@@ -4250,7 +4250,7 @@
                 <w:b/>
                 <w:bCs/>
               </w:rPr>
-              <w:t xml:space="preserve">3 - Sólido</w:t>
+              <w:t xml:space="preserve">4 - Destacado</w:t>
             </w:r>
           </w:p>
         </w:tc>
@@ -4292,7 +4292,7 @@
                 <w:b/>
                 <w:bCs/>
               </w:rPr>
-              <w:t xml:space="preserve">2 - En desarrollo</w:t>
+              <w:t xml:space="preserve">3 - Sólido</w:t>
             </w:r>
           </w:p>
         </w:tc>
@@ -4334,7 +4334,7 @@
                 <w:b/>
                 <w:bCs/>
               </w:rPr>
-              <w:t xml:space="preserve">1 - Inicial</w:t>
+              <w:t xml:space="preserve">2 - Básico</w:t>
             </w:r>
           </w:p>
         </w:tc>
@@ -4480,7 +4480,7 @@
                 <w:b/>
                 <w:bCs/>
               </w:rPr>
-              <w:t xml:space="preserve">3 - Sólido</w:t>
+              <w:t xml:space="preserve">4 - Destacado</w:t>
             </w:r>
           </w:p>
         </w:tc>
@@ -4522,7 +4522,7 @@
                 <w:b/>
                 <w:bCs/>
               </w:rPr>
-              <w:t xml:space="preserve">2 - En desarrollo</w:t>
+              <w:t xml:space="preserve">3 - Sólido</w:t>
             </w:r>
           </w:p>
         </w:tc>
@@ -4564,7 +4564,7 @@
                 <w:b/>
                 <w:bCs/>
               </w:rPr>
-              <w:t xml:space="preserve">1 - Inicial</w:t>
+              <w:t xml:space="preserve">2 - Básico</w:t>
             </w:r>
           </w:p>
         </w:tc>
@@ -4704,7 +4704,7 @@
                 <w:b/>
                 <w:bCs/>
               </w:rPr>
-              <w:t xml:space="preserve">3 - Sólido</w:t>
+              <w:t xml:space="preserve">4 - Destacado</w:t>
             </w:r>
           </w:p>
         </w:tc>
@@ -4746,7 +4746,7 @@
                 <w:b/>
                 <w:bCs/>
               </w:rPr>
-              <w:t xml:space="preserve">2 - En desarrollo</w:t>
+              <w:t xml:space="preserve">3 - Sólido</w:t>
             </w:r>
           </w:p>
         </w:tc>
@@ -4788,7 +4788,7 @@
                 <w:b/>
                 <w:bCs/>
               </w:rPr>
-              <w:t xml:space="preserve">1 - Inicial</w:t>
+              <w:t xml:space="preserve">2 - Básico</w:t>
             </w:r>
           </w:p>
         </w:tc>
@@ -4928,7 +4928,7 @@
                 <w:b/>
                 <w:bCs/>
               </w:rPr>
-              <w:t xml:space="preserve">3 - Sólido</w:t>
+              <w:t xml:space="preserve">4 - Destacado</w:t>
             </w:r>
           </w:p>
         </w:tc>
@@ -4970,7 +4970,7 @@
                 <w:b/>
                 <w:bCs/>
               </w:rPr>
-              <w:t xml:space="preserve">2 - En desarrollo</w:t>
+              <w:t xml:space="preserve">3 - Sólido</w:t>
             </w:r>
           </w:p>
         </w:tc>
@@ -5012,7 +5012,7 @@
                 <w:b/>
                 <w:bCs/>
               </w:rPr>
-              <w:t xml:space="preserve">1 - Inicial</w:t>
+              <w:t xml:space="preserve">2 - Básico</w:t>
             </w:r>
           </w:p>
         </w:tc>

</xml_diff>